<commit_message>
Fix RTL across all formats and remove budget/money references
- Wrap Markdown files in dir=rtl so GitHub renders them right-to-left
- Set Hebrew (he-IL) bidi language in the Word output
- Add RTL embedding to every Hebrew text element and speaker note in the slides
- Remove all budget, price and money mentions from both versions and the slides

Co-Authored-By: Claude Opus 5.5 <noreply@anthropic.com>
Claude-Session: https://claude.ai/code/session_01TveiFcZvfH5nXzWABhj7Zj
</commit_message>
<xml_diff>
--- a/hackathon-plan.docx
+++ b/hackathon-plan.docx
@@ -63,7 +63,7 @@
           <w:szCs w:val="28"/>
           <w:rtl/>
         </w:rPr>
-        <w:t xml:space="preserve">150 עובדים · יום עד יומיים · אפס תקציב · Claude ככלי עבודה מרכזי</w:t>
+        <w:t xml:space="preserve">150 עובדים · יום עד יומיים · Claude ככלי עבודה מרכזי</w:t>
       </w:r>
     </w:p>
     <w:p>
@@ -80,7 +80,7 @@
           <w:szCs w:val="22"/>
           <w:rtl/>
         </w:rPr>
-        <w:t xml:space="preserve">מסמך תכנון מלא להאקטון "AI-native": מטרות, פורמטים לבחירה, שימוש ב-Claude לפי תפקיד, מסלולים, בנק משימות, חלוקה לצוותים, לו"ז ליום אחד ולשני ימים, במה, שיפוט, לוגיסטיקה בעלות אפס, סיכונים וצ'קליסטים.</w:t>
+        <w:t xml:space="preserve">מסמך תכנון מלא להאקטון "AI-native": מטרות, פורמטים לבחירה, שימוש ב-Claude לפי תפקיד, מסלולים, בנק משימות, חלוקה לצוותים, לו"ז ליום אחד ולשני ימים, במה, שיפוט, לוגיסטיקה, סיכונים וצ'קליסטים.</w:t>
       </w:r>
     </w:p>
     <w:p>
@@ -184,7 +184,7 @@
           <w:szCs w:val="22"/>
           <w:rtl/>
         </w:rPr>
-        <w:t xml:space="preserve">האקטון של יום עד יומיים, לכ-150 עובדים, בלי תקציב — כשהמנוי הקיים ל-Claude הוא מכפיל הכוח. במקום אוכל, במה ומיתוג, ההשקעה היא בזמן, בהכנה ובשימוש חכם ב-AI. המטרה: לזהות כאבים אמיתיים ולהפוך אותם לפתרונות עובדים, ובדרך — להפוך את Claude לכלי עבודה יומיומי של כל החברה.</w:t>
+        <w:t xml:space="preserve">האקטון של יום עד יומיים, לכ-150 עובדים, כש-Claude הוא מכפיל הכוח. ההשקעה היא בזמן, בהכנה ובשימוש חכם ב-AI, עם המשאבים שכבר יש בחברה. המטרה: לזהות כאבים אמיתיים ולהפוך אותם לפתרונות עובדים, ובדרך — להפוך את Claude לכלי עבודה יומיומי של כל החברה.</w:t>
       </w:r>
     </w:p>
     <w:p>
@@ -357,7 +357,7 @@
           <w:szCs w:val="22"/>
           <w:rtl/>
         </w:rPr>
-        <w:t xml:space="preserve">אפס תקציב:</w:t>
+        <w:t xml:space="preserve">משאבים קיימים:</w:t>
       </w:r>
       <w:r>
         <w:rPr>
@@ -367,7 +367,7 @@
           <w:szCs w:val="22"/>
           <w:rtl/>
         </w:rPr>
-        <w:t xml:space="preserve"> משרד, ציוד קיים, Claude קיים, ופרסים שלא עולים כסף — זמן להמשיך, במה מול ההנהלה, הכרה.</w:t>
+        <w:t xml:space="preserve"> המשרד, הציוד ו-Claude שכבר זמין בחברה. הפרסים הם זמן להמשיך, במה מול ההנהלה והכרה.</w:t>
       </w:r>
     </w:p>
     <w:p>
@@ -2555,7 +2555,7 @@
           <w:szCs w:val="22"/>
           <w:rtl/>
         </w:rPr>
-        <w:t xml:space="preserve">הכסף הוא לא העיקר:</w:t>
+        <w:t xml:space="preserve">ההכרה היא העיקר:</w:t>
       </w:r>
       <w:r>
         <w:rPr>
@@ -2565,7 +2565,7 @@
           <w:szCs w:val="22"/>
           <w:rtl/>
         </w:rPr>
-        <w:t xml:space="preserve"> מה שאנשים זוכרים הוא הזמן, ההכרה והתוצאה — לא הארוחה.</w:t>
+        <w:t xml:space="preserve"> מה שאנשים זוכרים הוא הזמן, ההכרה והתוצאה.</w:t>
       </w:r>
     </w:p>
     <w:p>
@@ -4221,7 +4221,7 @@
           <w:szCs w:val="22"/>
           <w:rtl/>
         </w:rPr>
-        <w:t xml:space="preserve">אפס עלות נוספת:</w:t>
+        <w:t xml:space="preserve">כבר זמין:</w:t>
       </w:r>
       <w:r>
         <w:rPr>
@@ -4231,7 +4231,7 @@
           <w:szCs w:val="22"/>
           <w:rtl/>
         </w:rPr>
-        <w:t xml:space="preserve"> המנוי כבר קיים.</w:t>
+        <w:t xml:space="preserve"> Claude כבר בשימוש בחברה.</w:t>
       </w:r>
     </w:p>
     <w:p>
@@ -5236,7 +5236,7 @@
           <w:szCs w:val="22"/>
           <w:rtl/>
         </w:rPr>
-        <w:t xml:space="preserve">מנוי זה לא API:</w:t>
+        <w:t xml:space="preserve">גישת API:</w:t>
       </w:r>
       <w:r>
         <w:rPr>
@@ -12158,7 +12158,7 @@
                 <w:szCs w:val="19"/>
                 <w:rtl/>
               </w:rPr>
-              <w:t xml:space="preserve">בעלות + איזון + אפס זמן מבוזבז ביום</w:t>
+              <w:t xml:space="preserve">בעלות + איזון + בלי זמן מבוזבז ביום</w:t>
             </w:r>
           </w:p>
         </w:tc>
@@ -19717,7 +19717,7 @@
           <w:rFonts w:ascii="Arial" w:cs="Arial" w:eastAsia="Arial" w:hAnsi="Arial"/>
           <w:rtl/>
         </w:rPr>
-        <w:t xml:space="preserve">11. הבמה ואזור התצוגה — עם מה שיש</w:t>
+        <w:t xml:space="preserve">11. הבמה ואזור התצוגה</w:t>
       </w:r>
     </w:p>
     <w:p>
@@ -19822,7 +19822,7 @@
                 <w:szCs w:val="19"/>
                 <w:rtl/>
               </w:rPr>
-              <w:t xml:space="preserve">פתרון בעלות אפס</w:t>
+              <w:t xml:space="preserve">פתרון</w:t>
             </w:r>
           </w:p>
         </w:tc>
@@ -22456,7 +22456,7 @@
           <w:rFonts w:ascii="Arial" w:cs="Arial" w:eastAsia="Arial" w:hAnsi="Arial"/>
           <w:rtl/>
         </w:rPr>
-        <w:t xml:space="preserve">12.4 פרסים שלא עולים כסף</w:t>
+        <w:t xml:space="preserve">12.4 מה מקבלים הזוכים</w:t>
       </w:r>
     </w:p>
     <w:tbl>
@@ -23157,7 +23157,7 @@
           <w:rFonts w:ascii="Arial" w:cs="Arial" w:eastAsia="Arial" w:hAnsi="Arial"/>
           <w:rtl/>
         </w:rPr>
-        <w:t xml:space="preserve">13. לוגיסטיקה בעלות אפס</w:t>
+        <w:t xml:space="preserve">13. לוגיסטיקה</w:t>
       </w:r>
     </w:p>
     <w:p>
@@ -23170,7 +23170,7 @@
           <w:rFonts w:ascii="Arial" w:cs="Arial" w:eastAsia="Arial" w:hAnsi="Arial"/>
           <w:rtl/>
         </w:rPr>
-        <w:t xml:space="preserve">13.1 מה במקום כסף</w:t>
+        <w:t xml:space="preserve">13.1 מה צריך ואיך פותרים</w:t>
       </w:r>
     </w:p>
     <w:tbl>
@@ -23262,7 +23262,7 @@
                 <w:szCs w:val="19"/>
                 <w:rtl/>
               </w:rPr>
-              <w:t xml:space="preserve">פתרון בעלות אפס</w:t>
+              <w:t xml:space="preserve">פתרון</w:t>
             </w:r>
           </w:p>
         </w:tc>
@@ -23481,7 +23481,7 @@
                 <w:szCs w:val="19"/>
                 <w:rtl/>
               </w:rPr>
-              <w:t xml:space="preserve">המנוי הקיים</w:t>
+              <w:t xml:space="preserve">החשבונות הקיימים בחברה</w:t>
             </w:r>
           </w:p>
         </w:tc>
@@ -23857,34 +23857,6 @@
         <w:bidi/>
         <w:spacing w:after="160"/>
       </w:pPr>
-    </w:p>
-    <w:p>
-      <w:pPr>
-        <w:bidi/>
-        <w:spacing w:after="120" w:line="300"/>
-      </w:pPr>
-      <w:r>
-        <w:rPr>
-          <w:rFonts w:ascii="Arial" w:cs="Arial" w:eastAsia="Arial" w:hAnsi="Arial"/>
-          <w:b/>
-          <w:bCs/>
-          <w:color w:val="1F2330"/>
-          <w:sz w:val="22"/>
-          <w:szCs w:val="22"/>
-          <w:rtl/>
-        </w:rPr>
-        <w:t xml:space="preserve">אם בכל זאת אפשר להשיג סכום קטן</w:t>
-      </w:r>
-      <w:r>
-        <w:rPr>
-          <w:rFonts w:ascii="Arial" w:cs="Arial" w:eastAsia="Arial" w:hAnsi="Arial"/>
-          <w:color w:val="1F2330"/>
-          <w:sz w:val="22"/>
-          <w:szCs w:val="22"/>
-          <w:rtl/>
-        </w:rPr>
-        <w:t xml:space="preserve"> (למשל מתקציב רווחה או הדרכה קיים): קודם כל אוכל — כיבוד בוקר או פיצה בסוף היום משפיעים הכי הרבה על האנרגיה. אחר כך — פרס סמלי לזוכים.</w:t>
-      </w:r>
     </w:p>
     <w:p>
       <w:pPr>
@@ -25465,9 +25437,9 @@
         </w:tblBorders>
       </w:tblPr>
       <w:tblGrid>
-        <w:gridCol w:w="3790"/>
-        <w:gridCol w:w="758"/>
-        <w:gridCol w:w="5090"/>
+        <w:gridCol w:w="3407"/>
+        <w:gridCol w:w="681"/>
+        <w:gridCol w:w="5550"/>
       </w:tblGrid>
       <w:tr>
         <w:trPr>
@@ -25475,7 +25447,7 @@
         </w:trPr>
         <w:tc>
           <w:tcPr>
-            <w:tcW w:type="dxa" w:w="3790"/>
+            <w:tcW w:type="dxa" w:w="3407"/>
             <w:tcBorders>
               <w:top w:val="single" w:color="D5D3E6" w:sz="4"/>
               <w:left w:val="single" w:color="D5D3E6" w:sz="4"/>
@@ -25511,7 +25483,7 @@
         </w:tc>
         <w:tc>
           <w:tcPr>
-            <w:tcW w:type="dxa" w:w="758"/>
+            <w:tcW w:type="dxa" w:w="681"/>
             <w:tcBorders>
               <w:top w:val="single" w:color="D5D3E6" w:sz="4"/>
               <w:left w:val="single" w:color="D5D3E6" w:sz="4"/>
@@ -25547,7 +25519,7 @@
         </w:tc>
         <w:tc>
           <w:tcPr>
-            <w:tcW w:type="dxa" w:w="5090"/>
+            <w:tcW w:type="dxa" w:w="5550"/>
             <w:tcBorders>
               <w:top w:val="single" w:color="D5D3E6" w:sz="4"/>
               <w:left w:val="single" w:color="D5D3E6" w:sz="4"/>
@@ -25588,7 +25560,7 @@
         </w:trPr>
         <w:tc>
           <w:tcPr>
-            <w:tcW w:type="dxa" w:w="3790"/>
+            <w:tcW w:type="dxa" w:w="3407"/>
             <w:tcBorders>
               <w:top w:val="single" w:color="D5D3E6" w:sz="4"/>
               <w:left w:val="single" w:color="D5D3E6" w:sz="4"/>
@@ -25622,7 +25594,7 @@
         </w:tc>
         <w:tc>
           <w:tcPr>
-            <w:tcW w:type="dxa" w:w="758"/>
+            <w:tcW w:type="dxa" w:w="681"/>
             <w:tcBorders>
               <w:top w:val="single" w:color="D5D3E6" w:sz="4"/>
               <w:left w:val="single" w:color="D5D3E6" w:sz="4"/>
@@ -25656,7 +25628,7 @@
         </w:tc>
         <w:tc>
           <w:tcPr>
-            <w:tcW w:type="dxa" w:w="5090"/>
+            <w:tcW w:type="dxa" w:w="5550"/>
             <w:tcBorders>
               <w:top w:val="single" w:color="D5D3E6" w:sz="4"/>
               <w:left w:val="single" w:color="D5D3E6" w:sz="4"/>
@@ -25695,7 +25667,7 @@
         </w:trPr>
         <w:tc>
           <w:tcPr>
-            <w:tcW w:type="dxa" w:w="3790"/>
+            <w:tcW w:type="dxa" w:w="3407"/>
             <w:tcBorders>
               <w:top w:val="single" w:color="D5D3E6" w:sz="4"/>
               <w:left w:val="single" w:color="D5D3E6" w:sz="4"/>
@@ -25729,7 +25701,7 @@
         </w:tc>
         <w:tc>
           <w:tcPr>
-            <w:tcW w:type="dxa" w:w="758"/>
+            <w:tcW w:type="dxa" w:w="681"/>
             <w:tcBorders>
               <w:top w:val="single" w:color="D5D3E6" w:sz="4"/>
               <w:left w:val="single" w:color="D5D3E6" w:sz="4"/>
@@ -25763,7 +25735,7 @@
         </w:tc>
         <w:tc>
           <w:tcPr>
-            <w:tcW w:type="dxa" w:w="5090"/>
+            <w:tcW w:type="dxa" w:w="5550"/>
             <w:tcBorders>
               <w:top w:val="single" w:color="D5D3E6" w:sz="4"/>
               <w:left w:val="single" w:color="D5D3E6" w:sz="4"/>
@@ -25802,7 +25774,7 @@
         </w:trPr>
         <w:tc>
           <w:tcPr>
-            <w:tcW w:type="dxa" w:w="3790"/>
+            <w:tcW w:type="dxa" w:w="3407"/>
             <w:tcBorders>
               <w:top w:val="single" w:color="D5D3E6" w:sz="4"/>
               <w:left w:val="single" w:color="D5D3E6" w:sz="4"/>
@@ -25836,7 +25808,7 @@
         </w:tc>
         <w:tc>
           <w:tcPr>
-            <w:tcW w:type="dxa" w:w="758"/>
+            <w:tcW w:type="dxa" w:w="681"/>
             <w:tcBorders>
               <w:top w:val="single" w:color="D5D3E6" w:sz="4"/>
               <w:left w:val="single" w:color="D5D3E6" w:sz="4"/>
@@ -25870,7 +25842,7 @@
         </w:tc>
         <w:tc>
           <w:tcPr>
-            <w:tcW w:type="dxa" w:w="5090"/>
+            <w:tcW w:type="dxa" w:w="5550"/>
             <w:tcBorders>
               <w:top w:val="single" w:color="D5D3E6" w:sz="4"/>
               <w:left w:val="single" w:color="D5D3E6" w:sz="4"/>
@@ -25909,7 +25881,7 @@
         </w:trPr>
         <w:tc>
           <w:tcPr>
-            <w:tcW w:type="dxa" w:w="3790"/>
+            <w:tcW w:type="dxa" w:w="3407"/>
             <w:tcBorders>
               <w:top w:val="single" w:color="D5D3E6" w:sz="4"/>
               <w:left w:val="single" w:color="D5D3E6" w:sz="4"/>
@@ -25943,7 +25915,7 @@
         </w:tc>
         <w:tc>
           <w:tcPr>
-            <w:tcW w:type="dxa" w:w="758"/>
+            <w:tcW w:type="dxa" w:w="681"/>
             <w:tcBorders>
               <w:top w:val="single" w:color="D5D3E6" w:sz="4"/>
               <w:left w:val="single" w:color="D5D3E6" w:sz="4"/>
@@ -25977,7 +25949,7 @@
         </w:tc>
         <w:tc>
           <w:tcPr>
-            <w:tcW w:type="dxa" w:w="5090"/>
+            <w:tcW w:type="dxa" w:w="5550"/>
             <w:tcBorders>
               <w:top w:val="single" w:color="D5D3E6" w:sz="4"/>
               <w:left w:val="single" w:color="D5D3E6" w:sz="4"/>
@@ -26016,7 +25988,7 @@
         </w:trPr>
         <w:tc>
           <w:tcPr>
-            <w:tcW w:type="dxa" w:w="3790"/>
+            <w:tcW w:type="dxa" w:w="3407"/>
             <w:tcBorders>
               <w:top w:val="single" w:color="D5D3E6" w:sz="4"/>
               <w:left w:val="single" w:color="D5D3E6" w:sz="4"/>
@@ -26050,7 +26022,7 @@
         </w:tc>
         <w:tc>
           <w:tcPr>
-            <w:tcW w:type="dxa" w:w="758"/>
+            <w:tcW w:type="dxa" w:w="681"/>
             <w:tcBorders>
               <w:top w:val="single" w:color="D5D3E6" w:sz="4"/>
               <w:left w:val="single" w:color="D5D3E6" w:sz="4"/>
@@ -26084,35 +26056,35 @@
         </w:tc>
         <w:tc>
           <w:tcPr>
-            <w:tcW w:type="dxa" w:w="5090"/>
-            <w:tcBorders>
-              <w:top w:val="single" w:color="D5D3E6" w:sz="4"/>
-              <w:left w:val="single" w:color="D5D3E6" w:sz="4"/>
-              <w:bottom w:val="single" w:color="D5D3E6" w:sz="4"/>
-              <w:right w:val="single" w:color="D5D3E6" w:sz="4"/>
-            </w:tcBorders>
-            <w:shd w:fill="FFFFFF" w:color="auto" w:val="clear"/>
-            <w:tcMar>
-              <w:top w:type="dxa" w:w="70"/>
-              <w:left w:type="dxa" w:w="100"/>
-              <w:bottom w:type="dxa" w:w="70"/>
-              <w:right w:type="dxa" w:w="100"/>
-            </w:tcMar>
-          </w:tcPr>
-          <w:p>
-            <w:pPr>
-              <w:bidi/>
-              <w:spacing w:after="0" w:line="260"/>
-            </w:pPr>
-            <w:r>
-              <w:rPr>
-                <w:rFonts w:ascii="Arial" w:cs="Arial" w:eastAsia="Arial" w:hAnsi="Arial"/>
-                <w:color w:val="1F2330"/>
-                <w:sz w:val="19"/>
-                <w:szCs w:val="19"/>
-                <w:rtl/>
-              </w:rPr>
-              <w:t xml:space="preserve">לבדוק מראש את תנאי המנוי; לפזר עבודה בתוך הצוות</w:t>
+            <w:tcW w:type="dxa" w:w="5550"/>
+            <w:tcBorders>
+              <w:top w:val="single" w:color="D5D3E6" w:sz="4"/>
+              <w:left w:val="single" w:color="D5D3E6" w:sz="4"/>
+              <w:bottom w:val="single" w:color="D5D3E6" w:sz="4"/>
+              <w:right w:val="single" w:color="D5D3E6" w:sz="4"/>
+            </w:tcBorders>
+            <w:shd w:fill="FFFFFF" w:color="auto" w:val="clear"/>
+            <w:tcMar>
+              <w:top w:type="dxa" w:w="70"/>
+              <w:left w:type="dxa" w:w="100"/>
+              <w:bottom w:type="dxa" w:w="70"/>
+              <w:right w:type="dxa" w:w="100"/>
+            </w:tcMar>
+          </w:tcPr>
+          <w:p>
+            <w:pPr>
+              <w:bidi/>
+              <w:spacing w:after="0" w:line="260"/>
+            </w:pPr>
+            <w:r>
+              <w:rPr>
+                <w:rFonts w:ascii="Arial" w:cs="Arial" w:eastAsia="Arial" w:hAnsi="Arial"/>
+                <w:color w:val="1F2330"/>
+                <w:sz w:val="19"/>
+                <w:szCs w:val="19"/>
+                <w:rtl/>
+              </w:rPr>
+              <w:t xml:space="preserve">לבדוק מראש את מגבלות השימוש בחשבון; לפזר עבודה בתוך הצוות</w:t>
             </w:r>
           </w:p>
         </w:tc>
@@ -26123,7 +26095,7 @@
         </w:trPr>
         <w:tc>
           <w:tcPr>
-            <w:tcW w:type="dxa" w:w="3790"/>
+            <w:tcW w:type="dxa" w:w="3407"/>
             <w:tcBorders>
               <w:top w:val="single" w:color="D5D3E6" w:sz="4"/>
               <w:left w:val="single" w:color="D5D3E6" w:sz="4"/>
@@ -26157,7 +26129,7 @@
         </w:tc>
         <w:tc>
           <w:tcPr>
-            <w:tcW w:type="dxa" w:w="758"/>
+            <w:tcW w:type="dxa" w:w="681"/>
             <w:tcBorders>
               <w:top w:val="single" w:color="D5D3E6" w:sz="4"/>
               <w:left w:val="single" w:color="D5D3E6" w:sz="4"/>
@@ -26191,7 +26163,7 @@
         </w:tc>
         <w:tc>
           <w:tcPr>
-            <w:tcW w:type="dxa" w:w="5090"/>
+            <w:tcW w:type="dxa" w:w="5550"/>
             <w:tcBorders>
               <w:top w:val="single" w:color="D5D3E6" w:sz="4"/>
               <w:left w:val="single" w:color="D5D3E6" w:sz="4"/>
@@ -26230,41 +26202,41 @@
         </w:trPr>
         <w:tc>
           <w:tcPr>
-            <w:tcW w:type="dxa" w:w="3790"/>
-            <w:tcBorders>
-              <w:top w:val="single" w:color="D5D3E6" w:sz="4"/>
-              <w:left w:val="single" w:color="D5D3E6" w:sz="4"/>
-              <w:bottom w:val="single" w:color="D5D3E6" w:sz="4"/>
-              <w:right w:val="single" w:color="D5D3E6" w:sz="4"/>
-            </w:tcBorders>
-            <w:shd w:fill="FFFFFF" w:color="auto" w:val="clear"/>
-            <w:tcMar>
-              <w:top w:type="dxa" w:w="70"/>
-              <w:left w:type="dxa" w:w="100"/>
-              <w:bottom w:type="dxa" w:w="70"/>
-              <w:right w:type="dxa" w:w="100"/>
-            </w:tcMar>
-          </w:tcPr>
-          <w:p>
-            <w:pPr>
-              <w:bidi/>
-              <w:spacing w:after="0" w:line="260"/>
-            </w:pPr>
-            <w:r>
-              <w:rPr>
-                <w:rFonts w:ascii="Arial" w:cs="Arial" w:eastAsia="Arial" w:hAnsi="Arial"/>
-                <w:color w:val="1F2330"/>
-                <w:sz w:val="19"/>
-                <w:szCs w:val="19"/>
-                <w:rtl/>
-              </w:rPr>
-              <w:t xml:space="preserve">אנרגיה נמוכה בלי אוכל וכיבוד</w:t>
-            </w:r>
-          </w:p>
-        </w:tc>
-        <w:tc>
-          <w:tcPr>
-            <w:tcW w:type="dxa" w:w="758"/>
+            <w:tcW w:type="dxa" w:w="3407"/>
+            <w:tcBorders>
+              <w:top w:val="single" w:color="D5D3E6" w:sz="4"/>
+              <w:left w:val="single" w:color="D5D3E6" w:sz="4"/>
+              <w:bottom w:val="single" w:color="D5D3E6" w:sz="4"/>
+              <w:right w:val="single" w:color="D5D3E6" w:sz="4"/>
+            </w:tcBorders>
+            <w:shd w:fill="FFFFFF" w:color="auto" w:val="clear"/>
+            <w:tcMar>
+              <w:top w:type="dxa" w:w="70"/>
+              <w:left w:type="dxa" w:w="100"/>
+              <w:bottom w:type="dxa" w:w="70"/>
+              <w:right w:type="dxa" w:w="100"/>
+            </w:tcMar>
+          </w:tcPr>
+          <w:p>
+            <w:pPr>
+              <w:bidi/>
+              <w:spacing w:after="0" w:line="260"/>
+            </w:pPr>
+            <w:r>
+              <w:rPr>
+                <w:rFonts w:ascii="Arial" w:cs="Arial" w:eastAsia="Arial" w:hAnsi="Arial"/>
+                <w:color w:val="1F2330"/>
+                <w:sz w:val="19"/>
+                <w:szCs w:val="19"/>
+                <w:rtl/>
+              </w:rPr>
+              <w:t xml:space="preserve">אנרגיה נמוכה לאורך היום</w:t>
+            </w:r>
+          </w:p>
+        </w:tc>
+        <w:tc>
+          <w:tcPr>
+            <w:tcW w:type="dxa" w:w="681"/>
             <w:tcBorders>
               <w:top w:val="single" w:color="D5D3E6" w:sz="4"/>
               <w:left w:val="single" w:color="D5D3E6" w:sz="4"/>
@@ -26298,35 +26270,35 @@
         </w:tc>
         <w:tc>
           <w:tcPr>
-            <w:tcW w:type="dxa" w:w="5090"/>
-            <w:tcBorders>
-              <w:top w:val="single" w:color="D5D3E6" w:sz="4"/>
-              <w:left w:val="single" w:color="D5D3E6" w:sz="4"/>
-              <w:bottom w:val="single" w:color="D5D3E6" w:sz="4"/>
-              <w:right w:val="single" w:color="D5D3E6" w:sz="4"/>
-            </w:tcBorders>
-            <w:shd w:fill="FFFFFF" w:color="auto" w:val="clear"/>
-            <w:tcMar>
-              <w:top w:type="dxa" w:w="70"/>
-              <w:left w:type="dxa" w:w="100"/>
-              <w:bottom w:type="dxa" w:w="70"/>
-              <w:right w:type="dxa" w:w="100"/>
-            </w:tcMar>
-          </w:tcPr>
-          <w:p>
-            <w:pPr>
-              <w:bidi/>
-              <w:spacing w:after="0" w:line="260"/>
-            </w:pPr>
-            <w:r>
-              <w:rPr>
-                <w:rFonts w:ascii="Arial" w:cs="Arial" w:eastAsia="Arial" w:hAnsi="Arial"/>
-                <w:color w:val="1F2330"/>
-                <w:sz w:val="19"/>
-                <w:szCs w:val="19"/>
-                <w:rtl/>
-              </w:rPr>
-              <w:t xml:space="preserve">פינת קפה; "תביאו מהבית"; לנסות להשיג כיבוד קטן</w:t>
+            <w:tcW w:type="dxa" w:w="5550"/>
+            <w:tcBorders>
+              <w:top w:val="single" w:color="D5D3E6" w:sz="4"/>
+              <w:left w:val="single" w:color="D5D3E6" w:sz="4"/>
+              <w:bottom w:val="single" w:color="D5D3E6" w:sz="4"/>
+              <w:right w:val="single" w:color="D5D3E6" w:sz="4"/>
+            </w:tcBorders>
+            <w:shd w:fill="FFFFFF" w:color="auto" w:val="clear"/>
+            <w:tcMar>
+              <w:top w:type="dxa" w:w="70"/>
+              <w:left w:type="dxa" w:w="100"/>
+              <w:bottom w:type="dxa" w:w="70"/>
+              <w:right w:type="dxa" w:w="100"/>
+            </w:tcMar>
+          </w:tcPr>
+          <w:p>
+            <w:pPr>
+              <w:bidi/>
+              <w:spacing w:after="0" w:line="260"/>
+            </w:pPr>
+            <w:r>
+              <w:rPr>
+                <w:rFonts w:ascii="Arial" w:cs="Arial" w:eastAsia="Arial" w:hAnsi="Arial"/>
+                <w:color w:val="1F2330"/>
+                <w:sz w:val="19"/>
+                <w:szCs w:val="19"/>
+                <w:rtl/>
+              </w:rPr>
+              <w:t xml:space="preserve">פינת קפה פתוחה; הפסקות קבועות; "תביאו מהבית"</w:t>
             </w:r>
           </w:p>
         </w:tc>
@@ -26337,7 +26309,7 @@
         </w:trPr>
         <w:tc>
           <w:tcPr>
-            <w:tcW w:type="dxa" w:w="3790"/>
+            <w:tcW w:type="dxa" w:w="3407"/>
             <w:tcBorders>
               <w:top w:val="single" w:color="D5D3E6" w:sz="4"/>
               <w:left w:val="single" w:color="D5D3E6" w:sz="4"/>
@@ -26371,7 +26343,7 @@
         </w:tc>
         <w:tc>
           <w:tcPr>
-            <w:tcW w:type="dxa" w:w="758"/>
+            <w:tcW w:type="dxa" w:w="681"/>
             <w:tcBorders>
               <w:top w:val="single" w:color="D5D3E6" w:sz="4"/>
               <w:left w:val="single" w:color="D5D3E6" w:sz="4"/>
@@ -26405,7 +26377,7 @@
         </w:tc>
         <w:tc>
           <w:tcPr>
-            <w:tcW w:type="dxa" w:w="5090"/>
+            <w:tcW w:type="dxa" w:w="5550"/>
             <w:tcBorders>
               <w:top w:val="single" w:color="D5D3E6" w:sz="4"/>
               <w:left w:val="single" w:color="D5D3E6" w:sz="4"/>
@@ -26444,7 +26416,7 @@
         </w:trPr>
         <w:tc>
           <w:tcPr>
-            <w:tcW w:type="dxa" w:w="3790"/>
+            <w:tcW w:type="dxa" w:w="3407"/>
             <w:tcBorders>
               <w:top w:val="single" w:color="D5D3E6" w:sz="4"/>
               <w:left w:val="single" w:color="D5D3E6" w:sz="4"/>
@@ -26478,7 +26450,7 @@
         </w:tc>
         <w:tc>
           <w:tcPr>
-            <w:tcW w:type="dxa" w:w="758"/>
+            <w:tcW w:type="dxa" w:w="681"/>
             <w:tcBorders>
               <w:top w:val="single" w:color="D5D3E6" w:sz="4"/>
               <w:left w:val="single" w:color="D5D3E6" w:sz="4"/>
@@ -26512,7 +26484,7 @@
         </w:tc>
         <w:tc>
           <w:tcPr>
-            <w:tcW w:type="dxa" w:w="5090"/>
+            <w:tcW w:type="dxa" w:w="5550"/>
             <w:tcBorders>
               <w:top w:val="single" w:color="D5D3E6" w:sz="4"/>
               <w:left w:val="single" w:color="D5D3E6" w:sz="4"/>
@@ -26551,7 +26523,7 @@
         </w:trPr>
         <w:tc>
           <w:tcPr>
-            <w:tcW w:type="dxa" w:w="3790"/>
+            <w:tcW w:type="dxa" w:w="3407"/>
             <w:tcBorders>
               <w:top w:val="single" w:color="D5D3E6" w:sz="4"/>
               <w:left w:val="single" w:color="D5D3E6" w:sz="4"/>
@@ -26585,7 +26557,7 @@
         </w:tc>
         <w:tc>
           <w:tcPr>
-            <w:tcW w:type="dxa" w:w="758"/>
+            <w:tcW w:type="dxa" w:w="681"/>
             <w:tcBorders>
               <w:top w:val="single" w:color="D5D3E6" w:sz="4"/>
               <w:left w:val="single" w:color="D5D3E6" w:sz="4"/>
@@ -26619,7 +26591,7 @@
         </w:tc>
         <w:tc>
           <w:tcPr>
-            <w:tcW w:type="dxa" w:w="5090"/>
+            <w:tcW w:type="dxa" w:w="5550"/>
             <w:tcBorders>
               <w:top w:val="single" w:color="D5D3E6" w:sz="4"/>
               <w:left w:val="single" w:color="D5D3E6" w:sz="4"/>
@@ -29679,6 +29651,7 @@
         <w:sz w:val="22"/>
         <w:szCs w:val="22"/>
         <w:rtl/>
+        <w:lang w:val="he-IL" w:bidi="he-IL"/>
       </w:rPr>
     </w:rPrDefault>
     <w:pPrDefault>

</xml_diff>